<commit_message>
Parse _toc field from frontmatter into list of chapters
</commit_message>
<xml_diff>
--- a/tests/_fixtures/book-content-examples/frontmatter_extraction.docx
+++ b/tests/_fixtures/book-content-examples/frontmatter_extraction.docx
@@ -324,6 +324,104 @@
           </w:p>
         </w:tc>
       </w:tr>
+      <w:tr>
+        <w:tc>
+          <w:tcPr>
+            <w:cnfStyle w:val="001000000000" w:firstRow="0" w:lastRow="0" w:firstColumn="1" w:lastColumn="0" w:oddVBand="0" w:evenVBand="0" w:oddHBand="0" w:evenHBand="0" w:firstRowFirstColumn="0" w:firstRowLastColumn="0" w:lastRowFirstColumn="0" w:lastRowLastColumn="0"/>
+            <w:tcW w:w="1525" w:type="dxa"/>
+          </w:tcPr>
+          <w:p>
+            <w:pPr>
+              <w:pStyle w:val="Frontmatter"/>
+            </w:pPr>
+            <w:r>
+              <w:t>_toc</w:t>
+            </w:r>
+          </w:p>
+        </w:tc>
+        <w:tc>
+          <w:tcPr>
+            <w:tcW w:w="7825" w:type="dxa"/>
+          </w:tcPr>
+          <w:p>
+            <w:pPr>
+              <w:pStyle w:val="Frontmatter"/>
+              <w:numPr>
+                <w:ilvl w:val="0"/>
+                <w:numId w:val="42"/>
+              </w:numPr>
+              <w:cnfStyle w:val="000000000000" w:firstRow="0" w:lastRow="0" w:firstColumn="0" w:lastColumn="0" w:oddVBand="0" w:evenVBand="0" w:oddHBand="0" w:evenHBand="0" w:firstRowFirstColumn="0" w:firstRowLastColumn="0" w:lastRowFirstColumn="0" w:lastRowLastColumn="0"/>
+            </w:pPr>
+            <w:r>
+              <w:t>{bookmark: h1_index, prefix: I}</w:t>
+            </w:r>
+          </w:p>
+          <w:p>
+            <w:pPr>
+              <w:pStyle w:val="Frontmatter"/>
+              <w:numPr>
+                <w:ilvl w:val="0"/>
+                <w:numId w:val="42"/>
+              </w:numPr>
+              <w:cnfStyle w:val="000000000000" w:firstRow="0" w:lastRow="0" w:firstColumn="0" w:lastColumn="0" w:oddVBand="0" w:evenVBand="0" w:oddHBand="0" w:evenHBand="0" w:firstRowFirstColumn="0" w:firstRowLastColumn="0" w:lastRowFirstColumn="0" w:lastRowLastColumn="0"/>
+            </w:pPr>
+            <w:r>
+              <w:t>{bookmark: h1_infile, slug: in-file, prefix: 1</w:t>
+            </w:r>
+            <w:r>
+              <w:t xml:space="preserve">, </w:t>
+            </w:r>
+            <w:proofErr w:type="spellStart"/>
+            <w:r>
+              <w:t>wut</w:t>
+            </w:r>
+            <w:proofErr w:type="spellEnd"/>
+            <w:r>
+              <w:t>: nope</w:t>
+            </w:r>
+            <w:r>
+              <w:t>}</w:t>
+            </w:r>
+          </w:p>
+          <w:p>
+            <w:pPr>
+              <w:pStyle w:val="Frontmatter"/>
+              <w:numPr>
+                <w:ilvl w:val="0"/>
+                <w:numId w:val="42"/>
+              </w:numPr>
+              <w:cnfStyle w:val="000000000000" w:firstRow="0" w:lastRow="0" w:firstColumn="0" w:lastColumn="0" w:oddVBand="0" w:evenVBand="0" w:oddHBand="0" w:evenHBand="0" w:firstRowFirstColumn="0" w:firstRowLastColumn="0" w:lastRowFirstColumn="0" w:lastRowLastColumn="0"/>
+            </w:pPr>
+            <w:r>
+              <w:t>{bookmark: h1_isunicode, slug: is-</w:t>
+            </w:r>
+            <w:proofErr w:type="spellStart"/>
+            <w:r>
+              <w:t>unicode</w:t>
+            </w:r>
+            <w:proofErr w:type="spellEnd"/>
+            <w:r>
+              <w:t xml:space="preserve">-handled-well, prefix: 2, </w:t>
+            </w:r>
+            <w:proofErr w:type="spellStart"/>
+            <w:r>
+              <w:t>fn</w:t>
+            </w:r>
+            <w:proofErr w:type="spellEnd"/>
+            <w:r>
+              <w:t xml:space="preserve">: </w:t>
+            </w:r>
+            <w:proofErr w:type="spellStart"/>
+            <w:r>
+              <w:t>isunicode_with_custom_file_name</w:t>
+            </w:r>
+            <w:proofErr w:type="spellEnd"/>
+            <w:r>
+              <w:t>}</w:t>
+            </w:r>
+          </w:p>
+        </w:tc>
+      </w:tr>
     </w:tbl>
     <w:p>
       <w:pPr>
@@ -654,6 +752,7 @@
         <w:pStyle w:val="Heading4"/>
       </w:pPr>
       <w:r>
+        <w:lastRenderedPageBreak/>
         <w:t>Heading 4</w:t>
       </w:r>
     </w:p>
@@ -827,7 +926,6 @@
         <w:tc>
           <w:tcPr>
             <w:tcW w:w="1345" w:type="dxa"/>
-            <w:shd w:val="clear" w:color="auto" w:fill="auto"/>
             <w:vAlign w:val="center"/>
             <w:hideMark/>
           </w:tcPr>
@@ -882,7 +980,6 @@
         <w:tc>
           <w:tcPr>
             <w:tcW w:w="8000" w:type="dxa"/>
-            <w:shd w:val="clear" w:color="auto" w:fill="auto"/>
             <w:vAlign w:val="center"/>
           </w:tcPr>
           <w:p>
@@ -933,7 +1030,6 @@
         <w:tc>
           <w:tcPr>
             <w:tcW w:w="1345" w:type="dxa"/>
-            <w:shd w:val="clear" w:color="auto" w:fill="auto"/>
             <w:vAlign w:val="center"/>
           </w:tcPr>
           <w:p>
@@ -993,7 +1089,6 @@
         <w:tc>
           <w:tcPr>
             <w:tcW w:w="8000" w:type="dxa"/>
-            <w:shd w:val="clear" w:color="auto" w:fill="auto"/>
             <w:vAlign w:val="center"/>
           </w:tcPr>
           <w:p>
@@ -1044,7 +1139,6 @@
         <w:tc>
           <w:tcPr>
             <w:tcW w:w="1345" w:type="dxa"/>
-            <w:shd w:val="clear" w:color="auto" w:fill="auto"/>
             <w:vAlign w:val="center"/>
           </w:tcPr>
           <w:p>
@@ -1083,7 +1177,6 @@
         <w:tc>
           <w:tcPr>
             <w:tcW w:w="8000" w:type="dxa"/>
-            <w:shd w:val="clear" w:color="auto" w:fill="auto"/>
             <w:vAlign w:val="center"/>
           </w:tcPr>
           <w:p>
@@ -2367,6 +2460,119 @@
     </w:lvl>
   </w:abstractNum>
   <w:abstractNum w:abstractNumId="19" w15:restartNumberingAfterBreak="0">
+    <w:nsid w:val="369646D4"/>
+    <w:multiLevelType w:val="hybridMultilevel"/>
+    <w:tmpl w:val="0C9643C6"/>
+    <w:lvl w:ilvl="0" w:tplc="04090001">
+      <w:start w:val="1"/>
+      <w:numFmt w:val="bullet"/>
+      <w:lvlText w:val=""/>
+      <w:lvlJc w:val="left"/>
+      <w:pPr>
+        <w:ind w:left="720" w:hanging="360"/>
+      </w:pPr>
+      <w:rPr>
+        <w:rFonts w:ascii="Symbol" w:hAnsi="Symbol" w:hint="default"/>
+      </w:rPr>
+    </w:lvl>
+    <w:lvl w:ilvl="1" w:tplc="04090003" w:tentative="1">
+      <w:start w:val="1"/>
+      <w:numFmt w:val="bullet"/>
+      <w:lvlText w:val="o"/>
+      <w:lvlJc w:val="left"/>
+      <w:pPr>
+        <w:ind w:left="1440" w:hanging="360"/>
+      </w:pPr>
+      <w:rPr>
+        <w:rFonts w:ascii="Courier New" w:hAnsi="Courier New" w:cs="Courier New" w:hint="default"/>
+      </w:rPr>
+    </w:lvl>
+    <w:lvl w:ilvl="2" w:tplc="04090005" w:tentative="1">
+      <w:start w:val="1"/>
+      <w:numFmt w:val="bullet"/>
+      <w:lvlText w:val=""/>
+      <w:lvlJc w:val="left"/>
+      <w:pPr>
+        <w:ind w:left="2160" w:hanging="360"/>
+      </w:pPr>
+      <w:rPr>
+        <w:rFonts w:ascii="Wingdings" w:hAnsi="Wingdings" w:hint="default"/>
+      </w:rPr>
+    </w:lvl>
+    <w:lvl w:ilvl="3" w:tplc="04090001" w:tentative="1">
+      <w:start w:val="1"/>
+      <w:numFmt w:val="bullet"/>
+      <w:lvlText w:val=""/>
+      <w:lvlJc w:val="left"/>
+      <w:pPr>
+        <w:ind w:left="2880" w:hanging="360"/>
+      </w:pPr>
+      <w:rPr>
+        <w:rFonts w:ascii="Symbol" w:hAnsi="Symbol" w:hint="default"/>
+      </w:rPr>
+    </w:lvl>
+    <w:lvl w:ilvl="4" w:tplc="04090003" w:tentative="1">
+      <w:start w:val="1"/>
+      <w:numFmt w:val="bullet"/>
+      <w:lvlText w:val="o"/>
+      <w:lvlJc w:val="left"/>
+      <w:pPr>
+        <w:ind w:left="3600" w:hanging="360"/>
+      </w:pPr>
+      <w:rPr>
+        <w:rFonts w:ascii="Courier New" w:hAnsi="Courier New" w:cs="Courier New" w:hint="default"/>
+      </w:rPr>
+    </w:lvl>
+    <w:lvl w:ilvl="5" w:tplc="04090005" w:tentative="1">
+      <w:start w:val="1"/>
+      <w:numFmt w:val="bullet"/>
+      <w:lvlText w:val=""/>
+      <w:lvlJc w:val="left"/>
+      <w:pPr>
+        <w:ind w:left="4320" w:hanging="360"/>
+      </w:pPr>
+      <w:rPr>
+        <w:rFonts w:ascii="Wingdings" w:hAnsi="Wingdings" w:hint="default"/>
+      </w:rPr>
+    </w:lvl>
+    <w:lvl w:ilvl="6" w:tplc="04090001" w:tentative="1">
+      <w:start w:val="1"/>
+      <w:numFmt w:val="bullet"/>
+      <w:lvlText w:val=""/>
+      <w:lvlJc w:val="left"/>
+      <w:pPr>
+        <w:ind w:left="5040" w:hanging="360"/>
+      </w:pPr>
+      <w:rPr>
+        <w:rFonts w:ascii="Symbol" w:hAnsi="Symbol" w:hint="default"/>
+      </w:rPr>
+    </w:lvl>
+    <w:lvl w:ilvl="7" w:tplc="04090003" w:tentative="1">
+      <w:start w:val="1"/>
+      <w:numFmt w:val="bullet"/>
+      <w:lvlText w:val="o"/>
+      <w:lvlJc w:val="left"/>
+      <w:pPr>
+        <w:ind w:left="5760" w:hanging="360"/>
+      </w:pPr>
+      <w:rPr>
+        <w:rFonts w:ascii="Courier New" w:hAnsi="Courier New" w:cs="Courier New" w:hint="default"/>
+      </w:rPr>
+    </w:lvl>
+    <w:lvl w:ilvl="8" w:tplc="04090005" w:tentative="1">
+      <w:start w:val="1"/>
+      <w:numFmt w:val="bullet"/>
+      <w:lvlText w:val=""/>
+      <w:lvlJc w:val="left"/>
+      <w:pPr>
+        <w:ind w:left="6480" w:hanging="360"/>
+      </w:pPr>
+      <w:rPr>
+        <w:rFonts w:ascii="Wingdings" w:hAnsi="Wingdings" w:hint="default"/>
+      </w:rPr>
+    </w:lvl>
+  </w:abstractNum>
+  <w:abstractNum w:abstractNumId="20" w15:restartNumberingAfterBreak="0">
     <w:nsid w:val="457E48F3"/>
     <w:multiLevelType w:val="hybridMultilevel"/>
     <w:tmpl w:val="C2BA1482"/>
@@ -2479,7 +2685,7 @@
       </w:rPr>
     </w:lvl>
   </w:abstractNum>
-  <w:abstractNum w:abstractNumId="20" w15:restartNumberingAfterBreak="0">
+  <w:abstractNum w:abstractNumId="21" w15:restartNumberingAfterBreak="0">
     <w:nsid w:val="468E68A9"/>
     <w:multiLevelType w:val="multilevel"/>
     <w:tmpl w:val="0409001F"/>
@@ -2565,7 +2771,7 @@
       </w:pPr>
     </w:lvl>
   </w:abstractNum>
-  <w:abstractNum w:abstractNumId="21" w15:restartNumberingAfterBreak="0">
+  <w:abstractNum w:abstractNumId="22" w15:restartNumberingAfterBreak="0">
     <w:nsid w:val="50075D6F"/>
     <w:multiLevelType w:val="hybridMultilevel"/>
     <w:tmpl w:val="851854AC"/>
@@ -2678,7 +2884,7 @@
       </w:rPr>
     </w:lvl>
   </w:abstractNum>
-  <w:abstractNum w:abstractNumId="22" w15:restartNumberingAfterBreak="0">
+  <w:abstractNum w:abstractNumId="23" w15:restartNumberingAfterBreak="0">
     <w:nsid w:val="50FC0B20"/>
     <w:multiLevelType w:val="hybridMultilevel"/>
     <w:tmpl w:val="0A0E1832"/>
@@ -2791,7 +2997,7 @@
       </w:rPr>
     </w:lvl>
   </w:abstractNum>
-  <w:abstractNum w:abstractNumId="23" w15:restartNumberingAfterBreak="0">
+  <w:abstractNum w:abstractNumId="24" w15:restartNumberingAfterBreak="0">
     <w:nsid w:val="55DE722C"/>
     <w:multiLevelType w:val="hybridMultilevel"/>
     <w:tmpl w:val="6CA4556E"/>
@@ -2904,7 +3110,7 @@
       </w:rPr>
     </w:lvl>
   </w:abstractNum>
-  <w:abstractNum w:abstractNumId="24" w15:restartNumberingAfterBreak="0">
+  <w:abstractNum w:abstractNumId="25" w15:restartNumberingAfterBreak="0">
     <w:nsid w:val="575F210A"/>
     <w:multiLevelType w:val="hybridMultilevel"/>
     <w:tmpl w:val="846C9742"/>
@@ -3017,7 +3223,7 @@
       </w:rPr>
     </w:lvl>
   </w:abstractNum>
-  <w:abstractNum w:abstractNumId="25" w15:restartNumberingAfterBreak="0">
+  <w:abstractNum w:abstractNumId="26" w15:restartNumberingAfterBreak="0">
     <w:nsid w:val="57E53DFE"/>
     <w:multiLevelType w:val="hybridMultilevel"/>
     <w:tmpl w:val="F0A45532"/>
@@ -3130,7 +3336,7 @@
       </w:rPr>
     </w:lvl>
   </w:abstractNum>
-  <w:abstractNum w:abstractNumId="26" w15:restartNumberingAfterBreak="0">
+  <w:abstractNum w:abstractNumId="27" w15:restartNumberingAfterBreak="0">
     <w:nsid w:val="59A97AF0"/>
     <w:multiLevelType w:val="hybridMultilevel"/>
     <w:tmpl w:val="52E6B1EA"/>
@@ -3243,7 +3449,7 @@
       </w:rPr>
     </w:lvl>
   </w:abstractNum>
-  <w:abstractNum w:abstractNumId="27" w15:restartNumberingAfterBreak="0">
+  <w:abstractNum w:abstractNumId="28" w15:restartNumberingAfterBreak="0">
     <w:nsid w:val="69F120C8"/>
     <w:multiLevelType w:val="hybridMultilevel"/>
     <w:tmpl w:val="7D989BBE"/>
@@ -3356,7 +3562,7 @@
       </w:rPr>
     </w:lvl>
   </w:abstractNum>
-  <w:abstractNum w:abstractNumId="28" w15:restartNumberingAfterBreak="0">
+  <w:abstractNum w:abstractNumId="29" w15:restartNumberingAfterBreak="0">
     <w:nsid w:val="6FAC6D9D"/>
     <w:multiLevelType w:val="hybridMultilevel"/>
     <w:tmpl w:val="F7122796"/>
@@ -3469,7 +3675,7 @@
       </w:rPr>
     </w:lvl>
   </w:abstractNum>
-  <w:abstractNum w:abstractNumId="29" w15:restartNumberingAfterBreak="0">
+  <w:abstractNum w:abstractNumId="30" w15:restartNumberingAfterBreak="0">
     <w:nsid w:val="71315DCA"/>
     <w:multiLevelType w:val="multilevel"/>
     <w:tmpl w:val="19CE79B8"/>
@@ -3582,7 +3788,7 @@
       </w:pPr>
     </w:lvl>
   </w:abstractNum>
-  <w:abstractNum w:abstractNumId="30" w15:restartNumberingAfterBreak="0">
+  <w:abstractNum w:abstractNumId="31" w15:restartNumberingAfterBreak="0">
     <w:nsid w:val="74024FC2"/>
     <w:multiLevelType w:val="hybridMultilevel"/>
     <w:tmpl w:val="44ACD7FE"/>
@@ -3696,7 +3902,7 @@
       </w:rPr>
     </w:lvl>
   </w:abstractNum>
-  <w:abstractNum w:abstractNumId="31" w15:restartNumberingAfterBreak="0">
+  <w:abstractNum w:abstractNumId="32" w15:restartNumberingAfterBreak="0">
     <w:nsid w:val="7652062D"/>
     <w:multiLevelType w:val="hybridMultilevel"/>
     <w:tmpl w:val="5DA86FC8"/>
@@ -3828,7 +4034,7 @@
     <w:abstractNumId w:val="0"/>
   </w:num>
   <w:num w:numId="7" w16cid:durableId="234896716">
-    <w:abstractNumId w:val="29"/>
+    <w:abstractNumId w:val="30"/>
     <w:lvlOverride w:ilvl="0">
       <w:startOverride w:val="1"/>
     </w:lvlOverride>
@@ -3858,7 +4064,7 @@
     </w:lvlOverride>
   </w:num>
   <w:num w:numId="8" w16cid:durableId="404761754">
-    <w:abstractNumId w:val="29"/>
+    <w:abstractNumId w:val="30"/>
     <w:lvlOverride w:ilvl="0">
       <w:startOverride w:val="1"/>
     </w:lvlOverride>
@@ -3930,19 +4136,19 @@
     <w:abstractNumId w:val="1"/>
   </w:num>
   <w:num w:numId="23" w16cid:durableId="1483038871">
+    <w:abstractNumId w:val="21"/>
+  </w:num>
+  <w:num w:numId="24" w16cid:durableId="135612909">
     <w:abstractNumId w:val="20"/>
   </w:num>
-  <w:num w:numId="24" w16cid:durableId="135612909">
-    <w:abstractNumId w:val="19"/>
-  </w:num>
   <w:num w:numId="25" w16cid:durableId="1802571389">
-    <w:abstractNumId w:val="30"/>
+    <w:abstractNumId w:val="31"/>
   </w:num>
   <w:num w:numId="26" w16cid:durableId="1831215977">
     <w:abstractNumId w:val="17"/>
   </w:num>
   <w:num w:numId="27" w16cid:durableId="1569221027">
-    <w:abstractNumId w:val="26"/>
+    <w:abstractNumId w:val="27"/>
   </w:num>
   <w:num w:numId="28" w16cid:durableId="1929918828">
     <w:abstractNumId w:val="14"/>
@@ -3954,22 +4160,22 @@
     <w:abstractNumId w:val="12"/>
   </w:num>
   <w:num w:numId="31" w16cid:durableId="1011302362">
+    <w:abstractNumId w:val="26"/>
+  </w:num>
+  <w:num w:numId="32" w16cid:durableId="618492491">
+    <w:abstractNumId w:val="32"/>
+  </w:num>
+  <w:num w:numId="33" w16cid:durableId="2018534185">
+    <w:abstractNumId w:val="24"/>
+  </w:num>
+  <w:num w:numId="34" w16cid:durableId="1129012035">
     <w:abstractNumId w:val="25"/>
   </w:num>
-  <w:num w:numId="32" w16cid:durableId="618492491">
-    <w:abstractNumId w:val="31"/>
-  </w:num>
-  <w:num w:numId="33" w16cid:durableId="2018534185">
-    <w:abstractNumId w:val="23"/>
-  </w:num>
-  <w:num w:numId="34" w16cid:durableId="1129012035">
-    <w:abstractNumId w:val="24"/>
-  </w:num>
   <w:num w:numId="35" w16cid:durableId="445462800">
-    <w:abstractNumId w:val="21"/>
+    <w:abstractNumId w:val="22"/>
   </w:num>
   <w:num w:numId="36" w16cid:durableId="659430093">
-    <w:abstractNumId w:val="28"/>
+    <w:abstractNumId w:val="29"/>
   </w:num>
   <w:num w:numId="37" w16cid:durableId="469515221">
     <w:abstractNumId w:val="15"/>
@@ -3981,10 +4187,13 @@
     <w:abstractNumId w:val="18"/>
   </w:num>
   <w:num w:numId="40" w16cid:durableId="677007384">
-    <w:abstractNumId w:val="27"/>
+    <w:abstractNumId w:val="28"/>
   </w:num>
   <w:num w:numId="41" w16cid:durableId="1116485824">
-    <w:abstractNumId w:val="22"/>
+    <w:abstractNumId w:val="23"/>
+  </w:num>
+  <w:num w:numId="42" w16cid:durableId="532037974">
+    <w:abstractNumId w:val="19"/>
   </w:num>
 </w:numbering>
 </file>

</xml_diff>